<commit_message>
Encadeia o saldo credor nas planilhas de vincendas e custas
Co-Authored-By: Claude Sonnet 5.5 <noreply@anthropic.com>
Claude-Session: https://claude.ai/code/session_01QsTZQWswiYLDJVnB7uYzUe
</commit_message>
<xml_diff>
--- a/Manifestacao_Quitacao/Manifestação sobre a quitação - Mundo FIDC x CEF.docx
+++ b/Manifestacao_Quitacao/Manifestação sobre a quitação - Mundo FIDC x CEF.docx
@@ -1162,23 +1162,39 @@
           <w:b w:val="0"/>
           <w:i w:val="0"/>
         </w:rPr>
-        <w:t>Posteriormente ao levantamento, venceram quatro parcelas, que, atualizadas até 13 de outubro de 2026, somam R$ 302,63 (trezentos e dois reais e sessenta e três centavos), conforme o documento 3. A esse valor somam-se as custas de R$ 216,00 do documento 4, o que totaliza R$ 518,63 (quinhentos e dezoito reais e sessenta e três centavos).</w:t>
-      </w:r>
-    </w:p>
-    <w:p>
-      <w:pPr>
-        <w:spacing w:before="0" w:after="240" w:lineRule="auto" w:line="276"/>
-        <w:ind w:firstLine="2835" w:left="0" w:right="0"/>
-        <w:jc w:val="both"/>
-      </w:pPr>
-      <w:r/>
-      <w:r>
-        <w:rPr>
-          <w:rFonts w:ascii="Arial Narrow" w:hAnsi="Arial Narrow" w:eastAsia="Arial Narrow"/>
-          <w:b w:val="0"/>
-          <w:i w:val="0"/>
-        </w:rPr>
-        <w:t>Compensado esse total com o saldo credor, o crédito exequendo, incluídas as taxas vencidas até 13 de outubro de 2026 e as custas, encontra-se integralmente satisfeito, remanescendo, em valor nominal apurado nessa data, saldo credor de R$ 3.627,95 (três mil, seiscentos e vinte e sete reais e noventa e cinco centavos) em favor da executada. Por lealdade e boa-fé processuais, nos termos do art. 5º do Código de Processo Civil, a exequente informa e reconhece essa conclusão.</w:t>
+        <w:t>Posteriormente ao levantamento, venceram quatro parcelas, que, atualizadas até 13 de outubro de 2026, somam R$ 302,63 (trezentos e dois reais e sessenta e três centavos). Abatido esse valor do saldo credor, a planilha de documento 3 apresenta saldo credor de R$ 3.843,95 (três mil, oitocentos e quarenta e três reais e noventa e cinco centavos).</w:t>
+      </w:r>
+    </w:p>
+    <w:p>
+      <w:pPr>
+        <w:spacing w:before="0" w:after="240" w:lineRule="auto" w:line="276"/>
+        <w:ind w:firstLine="2835" w:left="0" w:right="0"/>
+        <w:jc w:val="both"/>
+      </w:pPr>
+      <w:r/>
+      <w:r>
+        <w:rPr>
+          <w:rFonts w:ascii="Arial Narrow" w:hAnsi="Arial Narrow" w:eastAsia="Arial Narrow"/>
+          <w:b w:val="0"/>
+          <w:i w:val="0"/>
+        </w:rPr>
+        <w:t>Por fim, as custas antecipadas pela exequente, atualizadas até a mesma data, somam R$ 216,00 (duzentos e dezesseis reais). Abatidas do saldo credor anterior, a planilha de documento 4 apresenta o saldo credor final de R$ 3.627,95 (três mil, seiscentos e vinte e sete reais e noventa e cinco centavos).</w:t>
+      </w:r>
+    </w:p>
+    <w:p>
+      <w:pPr>
+        <w:spacing w:before="0" w:after="240" w:lineRule="auto" w:line="276"/>
+        <w:ind w:firstLine="2835" w:left="0" w:right="0"/>
+        <w:jc w:val="both"/>
+      </w:pPr>
+      <w:r/>
+      <w:r>
+        <w:rPr>
+          <w:rFonts w:ascii="Arial Narrow" w:hAnsi="Arial Narrow" w:eastAsia="Arial Narrow"/>
+          <w:b w:val="0"/>
+          <w:i w:val="0"/>
+        </w:rPr>
+        <w:t>Dessa forma, o crédito exequendo, incluídas as taxas vencidas até 13 de outubro de 2026 e as custas, encontra-se integralmente satisfeito, e o valor levantado a maior, em valor nominal apurado nessa data, é de R$ 3.627,95, em favor da executada. Por lealdade e boa-fé processuais, nos termos do art. 5º do Código de Processo Civil, a exequente informa e reconhece essa conclusão.</w:t>
       </w:r>
     </w:p>
     <w:p>

</xml_diff>